<commit_message>
Fix failure count, stale A.3 note, Figure 1 wording, and §5.3 phrasing
- Sec. 5.1: 239 -> 479 (240 Anthropic + 239 OpenAI) for the semantic-only
  validation failures, excluding the one non-parseable OpenAI response
- Delete Appendix A.3's now-stale note referring to placeholders that have
  already been substituted with real vocabulary values in the built docx
- Figure 1 caption/suptitle: "bare = 0" -> "bare = not scored", matching
  Table 1's "n/a" (those outputs are excluded from scoring, not scored at 0)
- Sec. 5.3: state the gated-thread count change (36 -> 56) without the
  "more than doubles" framing
</commit_message>
<xml_diff>
--- a/manuscript.docx
+++ b/manuscript.docx
@@ -1817,7 +1817,7 @@
         <w:t>n_eval_split_matched = 0</w:t>
       </w:r>
       <w:r>
-        <w:t xml:space="preserve"> for both providers' bare runs); the OpenAI run's 240th thread is a separate failure mode, never producing a parseable response at all (§5.5). Excluding that single non-parseable case, the remaining 239 Anthropic-and-OpenAI failures are not parsing failures (each response parses as well-formed JSON) but a semantic one: without the taxonomy in the prompt, the model free-texts plausible-sounding but out-of-vocabulary values. A representative failure (</w:t>
+        <w:t xml:space="preserve"> for both providers' bare runs); the OpenAI run's 240th thread is a separate failure mode, never producing a parseable response at all (§5.5). Excluding that single non-parseable case, the remaining 479 failures (240 Anthropic, 239 OpenAI) are not parsing failures (each response parses as well-formed JSON) but a semantic one: without the taxonomy in the prompt, the model free-texts plausible-sounding but out-of-vocabulary values. A representative failure (</w:t>
       </w:r>
       <w:r>
         <w:rPr>
@@ -1966,7 +1966,7 @@
           <w:b/>
           <w:sz w:val="20"/>
         </w:rPr>
-        <w:t>Figure 1. Reviewer-routing accuracy by prompt condition, scoring arm, and provider (Anthropic claude-sonnet-5 and OpenAI gpt-5; bare = 0 for every arm/provider because 100% of its outputs failed closed-vocabulary schema validation and were excluded).</w:t>
+        <w:t>Figure 1. Reviewer-routing accuracy by prompt condition, scoring arm, and provider (Anthropic claude-sonnet-5 and OpenAI gpt-5; bare = not scored for every arm/provider because 100% of its outputs failed closed-vocabulary schema validation and were excluded).</w:t>
       </w:r>
     </w:p>
     <w:p>
@@ -3025,7 +3025,7 @@
         <w:pStyle w:val="BodyText"/>
       </w:pPr>
       <w:r>
-        <w:t xml:space="preserve">Under vocab, the composed arm's 36 gated EVAL-split threads (3 by low confidence, 34 by an escalation flag) score 38.9% reviewer accuracy versus 81.1% for the 164 ungated threads, an over-40-point split. Under policy, 56 threads are gated (55 by escalation, 1 by confidence), scoring 39.3% vs. 87.5% ungated. Gating more than doubles under policy (36 → 56 threads), plausibly because seeing the routing-policy text makes the model more willing to flag </w:t>
+        <w:t xml:space="preserve">Under vocab, the composed arm's 36 gated EVAL-split threads (3 by low confidence, 34 by an escalation flag) score 38.9% reviewer accuracy versus 81.1% for the 164 ungated threads, an over-40-point split. Under policy, 56 threads are gated (55 by escalation, 1 by confidence), scoring 39.3% vs. 87.5% ungated. The number gated increases from 36 to 56 under policy, plausibly because seeing the routing-policy text makes the model more willing to flag </w:t>
       </w:r>
       <w:r>
         <w:rPr>
@@ -4099,68 +4099,6 @@
           <w:sz w:val="18"/>
         </w:rPr>
         <w:t>assigned_reviewer (exactly one): Architect of Record, Structural Engineer, Mechanical Engineer, Electrical Engineer, Plumbing/Fire Protection Engineer, Civil Engineer, GC Superintendent, Owner's Representative, Cost/Change-Order Manager, Code Official/AHJ Liaison</w:t>
-      </w:r>
-    </w:p>
-    <w:p>
-      <w:pPr>
-        <w:pStyle w:val="BodyText"/>
-      </w:pPr>
-      <w:r>
-        <w:t xml:space="preserve">(The five </w:t>
-      </w:r>
-      <w:r>
-        <w:rPr>
-          <w:rFonts w:ascii="Consolas" w:hAnsi="Consolas"/>
-        </w:rPr>
-        <w:t>{...}</w:t>
-      </w:r>
-      <w:r>
-        <w:t xml:space="preserve"> placeholders above are shown here for readability; </w:t>
-      </w:r>
-      <w:r>
-        <w:rPr>
-          <w:rFonts w:ascii="Consolas" w:hAnsi="Consolas"/>
-        </w:rPr>
-        <w:t>code/build_docx.py</w:t>
-      </w:r>
-      <w:r>
-        <w:t xml:space="preserve">'s </w:t>
-      </w:r>
-      <w:r>
-        <w:rPr>
-          <w:rFonts w:ascii="Consolas" w:hAnsi="Consolas"/>
-        </w:rPr>
-        <w:t>apply_vocab_substitutions()</w:t>
-      </w:r>
-      <w:r>
-        <w:t xml:space="preserve"> replaces each one with </w:t>
-      </w:r>
-      <w:r>
-        <w:rPr>
-          <w:rFonts w:ascii="Consolas" w:hAnsi="Consolas"/>
-        </w:rPr>
-        <w:t>vocabulary.py</w:t>
-      </w:r>
-      <w:r>
-        <w:t xml:space="preserve">'s actual constants when the submission </w:t>
-      </w:r>
-      <w:r>
-        <w:rPr>
-          <w:rFonts w:ascii="Consolas" w:hAnsi="Consolas"/>
-        </w:rPr>
-        <w:t>.docx</w:t>
-      </w:r>
-      <w:r>
-        <w:t xml:space="preserve"> is built, so the delivered manuscript's Appendix A.3 shows the literal rendered vocabulary values, not this placeholder markup, and can't silently drift from </w:t>
-      </w:r>
-      <w:r>
-        <w:rPr>
-          <w:rFonts w:ascii="Consolas" w:hAnsi="Consolas"/>
-        </w:rPr>
-        <w:t>vocabulary.py</w:t>
-      </w:r>
-      <w:r>
-        <w:t xml:space="preserve"> the way a hand-copied list could.)</w:t>
       </w:r>
     </w:p>
     <w:p>

</xml_diff>

<commit_message>
Stack Figure 1's two provider panels vertically instead of side-by-side
Side-by-side put five arm groups per panel into half the figure width,
squeezing bar labels together. Stacking rows gives each panel the full
width.
</commit_message>
<xml_diff>
--- a/manuscript.docx
+++ b/manuscript.docx
@@ -1925,7 +1925,7 @@
       <w:r>
         <w:drawing>
           <wp:inline xmlns:a="http://schemas.openxmlformats.org/drawingml/2006/main" xmlns:pic="http://schemas.openxmlformats.org/drawingml/2006/picture">
-            <wp:extent cx="5029200" cy="1885950"/>
+            <wp:extent cx="5029200" cy="6106886"/>
             <wp:docPr id="1" name="Picture 1"/>
             <wp:cNvGraphicFramePr>
               <a:graphicFrameLocks noChangeAspect="1"/>
@@ -1946,7 +1946,7 @@
                   <pic:spPr>
                     <a:xfrm>
                       <a:off x="0" y="0"/>
-                      <a:ext cx="5029200" cy="1885950"/>
+                      <a:ext cx="5029200" cy="6106886"/>
                     </a:xfrm>
                     <a:prstGeom prst="rect"/>
                   </pic:spPr>

</xml_diff>

<commit_message>
Trim repetition: one gap-statement per Related Work section, shorter abstract/conclusion
- Sec 2: remove the per-study "this paper fills the gap" sentence after
  each citation (2.1, 2.2, 2.3, 2.5); keep the comparison once, at the
  end of the section (2.8), as the Introduction already states the
  contribution.
- Abstract: drop the gating and annotator-agreement figures (already in
  §5.3/§5.4); keep the question, method, principal numbers, and limitation.
- Conclusion §7: reduce the first paragraph to the finding and its limit,
  removing the repeated numbers/five-arm explanation already in §5.

Co-Authored-By: Claude Sonnet 5 <noreply@anthropic.com>
</commit_message>
<xml_diff>
--- a/manuscript.docx
+++ b/manuscript.docx
@@ -63,7 +63,7 @@
         <w:t>what part of the prompt actually earns that reliability</w:t>
       </w:r>
       <w:r>
-        <w:t>. We construct a stratified, synthetic corpus of 240 RFI threads spanning six RFI types, eight disciplines, four urgency tiers, and seven adversarial stress conditions, generated under two anti-fabrication contracts guaranteeing every extracted deadline phrase and referenced document is a verbatim substring of its source thread. Against this corpus we run a three-condition ablation — schema-only ("bare"), schema plus closed vocabularies ("vocab"), and vocab plus a plain-language routing policy ("policy") — with a credentialed LLM (Anthropic Claude Sonnet 5). The bare condition fails outright: 100% of 240 outputs violate a closed-vocabulary or cross-field validation rule and are excluded from scoring. Under vocab, composing the LLM's classification fields with a deterministic routing policy reaches 73.5% reviewer-assignment accuracy against gold labels (Cohen's κ=0.700) versus an 85.5% oracle ceiling (κ=0.834) and a 7.5% majority baseline; adding the policy text itself does not improve on vocab's accuracy. Confidence/escalation gating separates a small (18%), genuinely hard subpopulation (≈39% accuracy) from a large majority routed at over 81% accuracy. A disclosed LLM proxy for a second annotator, used because no human coder was available and reported as a limitation, not a claim of human-human reliability, agrees with gold at Krippendorff's α=0.914 (discipline), 0.818 (urgency), and 0.484 (escalation). A full replication with a second provider (OpenAI GPT-5) across all three conditions confirms both headline findings: the bare condition again fails outright (239/240 outputs schema-invalid, the 240th failing before a parseable response), and composed reviewer-assignment accuracy is materially unchanged by the policy-text addition (74.0% vocab vs. 74.0% policy, vs. Anthropic's 73.5% vocab vs. 74.0% policy), with both providers' vocab/policy accuracy landing within 1.5 points of each other on every scoring arm.</w:t>
+        <w:t>. We construct a stratified, synthetic corpus of 240 RFI threads spanning six RFI types, eight disciplines, four urgency tiers, and seven adversarial stress conditions, generated under two anti-fabrication contracts guaranteeing every extracted deadline phrase and referenced document is a verbatim substring of its source thread. Against this corpus we run a three-condition ablation — schema-only ("bare"), schema plus closed vocabularies ("vocab"), and vocab plus a plain-language routing policy ("policy") — with a credentialed LLM (Anthropic Claude Sonnet 5). The bare condition fails outright: 100% of 240 outputs violate a closed-vocabulary or cross-field validation rule and are excluded from scoring. Under vocab, composing the LLM's classification fields with a deterministic routing policy reaches 73.5% reviewer-assignment accuracy against gold labels (Cohen's κ=0.700) versus an 85.5% oracle ceiling (κ=0.834) and a 7.5% majority baseline; adding the policy text itself does not improve on vocab's accuracy. A full replication with a second provider (OpenAI GPT-5) across all three conditions confirms both headline findings: the bare condition again fails outright (239/240 outputs schema-invalid, the 240th failing before a parseable response), and composed reviewer-assignment accuracy is materially unchanged by the policy-text addition (74.0% vocab vs. 74.0% policy, vs. Anthropic's 73.5% vocab vs. 74.0% policy), with both providers' vocab/policy accuracy landing within 1.5 points of each other on every scoring arm. This is a pilot-scale study on a single synthetic corpus with one run per provider/condition cell; performance on real project RFIs remains untested.</w:t>
       </w:r>
     </w:p>
     <w:p>
@@ -176,7 +176,7 @@
         <w:pStyle w:val="BodyText"/>
       </w:pPr>
       <w:r>
-        <w:t>RFIs have been studied directly as a source of schedule and cost risk. Hanna et al. [7] establish benchmark RFI volumes and turnaround times for major highway projects, and Mohamed et al. [8] quantify the direct time and cost the RFI process itself adds to a project. Aibinu et al. [9] extend this to a data-analytic study of RFI frequency and turnaround time across a larger project sample, and Joy et al. [10] motivate digitizing and automating the RFI process specifically, framing it, as this paper does, as a workflow bottleneck instead of a purely contractual formality. The one existing attempt to apply a large language model to the RFI process itself, Panahi et al.'s [1] ChatGPT-based RFI recommender for pre-construction design review, is the closest direct precedent to this paper's task; it targets recommendation, not the closed-vocabulary schema validity and policy-grounded routing this paper isolates, which is the gap this paper's ablation is designed to fill.</w:t>
+        <w:t>RFIs have been studied directly as a source of schedule and cost risk. Hanna et al. [7] establish benchmark RFI volumes and turnaround times for major highway projects, and Mohamed et al. [8] quantify the direct time and cost the RFI process itself adds to a project. Aibinu et al. [9] extend this to a data-analytic study of RFI frequency and turnaround time across a larger project sample, and Joy et al. [10] motivate digitizing and automating the RFI process specifically, framing it, as this paper does, as a workflow bottleneck instead of a purely contractual formality. The one existing attempt to apply a large language model to the RFI process itself, Panahi et al.'s [1] ChatGPT-based RFI recommender for pre-construction design review, is the closest direct precedent to this paper's task; it targets recommendation, not closed-vocabulary schema validity or policy-grounded routing.</w:t>
       </w:r>
     </w:p>
     <w:p>
@@ -192,7 +192,7 @@
         <w:pStyle w:val="BodyText"/>
       </w:pPr>
       <w:r>
-        <w:t>A separate line of work applies text classification and information extraction to other construction document types — specifications, submittals, and contracts — without targeting RFIs specifically. Xu et al. [11] survey text-mining applications across the construction industry and identify a persistent gap between narrow proof-of-concept classifiers and deployable pipelines with explicit validity guarantees, the gap this paper's closed-vocabulary ablation addresses for one task. Moon et al. [12] use a BERT-based classifier to detect contractual risk clauses in specifications, Pham and Han [13] apply multitask classification to predict risk-handling actions in construction contracts, and Dikmen et al. [14] combine NLP and machine learning for automated contract risk and responsibility assessment. None of these apply a closed-vocabulary or policy-conditioning ablation to isolate which part of a prompt is responsible for a model's output validity, which is this paper's specific contribution relative to this cluster.</w:t>
+        <w:t>A separate line of work applies text classification and information extraction to other construction document types — specifications, submittals, and contracts — without targeting RFIs specifically. Xu et al. [11] survey text-mining applications across the construction industry and identify a persistent gap between narrow proof-of-concept classifiers and deployable pipelines with explicit validity guarantees. Moon et al. [12] use a BERT-based classifier to detect contractual risk clauses in specifications, Pham and Han [13] apply multitask classification to predict risk-handling actions in construction contracts, and Dikmen et al. [14] combine NLP and machine learning for automated contract risk and responsibility assessment.</w:t>
       </w:r>
     </w:p>
     <w:p>
@@ -208,7 +208,7 @@
         <w:pStyle w:val="BodyText"/>
       </w:pPr>
       <w:r>
-        <w:t>Beyond text classification, LLMs are increasingly applied to broader AEC reasoning tasks. Zheng et al. [15] use a knowledge-graph-enhanced LLM to automate construction contract review, Erfani and Khanjar [16] compare several LLMs on construction risk classification, and Emara [17] applies an ontology-driven GPT-4 pipeline to question-answering over construction standards. Two recent reviews, Kampelopoulos et al. [2] and Gao et al. [3], survey LLM applications and implementation strategies across the AEC industry more broadly, and both identify structured-output reliability as an open challenge for deployment; this paper treats that challenge as its central empirical question, not merely a stated limitation.</w:t>
+        <w:t>Beyond text classification, LLMs are increasingly applied to broader AEC reasoning tasks. Zheng et al. [15] use a knowledge-graph-enhanced LLM to automate construction contract review, Erfani and Khanjar [16] compare several LLMs on construction risk classification, and Emara [17] applies an ontology-driven GPT-4 pipeline to question-answering over construction standards. Two recent reviews, Kampelopoulos et al. [2] and Gao et al. [3], survey LLM applications and implementation strategies across the AEC industry more broadly, and both identify structured-output reliability as an open challenge for deployment.</w:t>
       </w:r>
     </w:p>
     <w:p>
@@ -285,7 +285,7 @@
         <w:t>human reviewer</w:t>
       </w:r>
       <w:r>
-        <w:t>, but the underlying question (can a fixed, auditable routing rule be driven reliably by LLM-produced classification fields) is the same. Zhou and Li [19] apply few-shot LLM classification to triage patient inquiries into actionable categories, and Madeyski [20] routes software engineering tasks to cost-tiered LLMs using code-quality signals; both are ticket/task routing analogues this paper's five-arm routing evaluation (§4.1) generalizes by separating classification-field noise from routing-rule divergence, which neither prior study isolates explicitly.</w:t>
+        <w:t>, but the underlying question (can a fixed, auditable routing rule be driven reliably by LLM-produced classification fields) is the same. Zhou and Li [19] apply few-shot LLM classification to triage patient inquiries into actionable categories, and Madeyski [20] routes software engineering tasks to cost-tiered LLMs using code-quality signals; both are ticket/task routing analogues to this paper's five-arm routing evaluation (§4.1), which separates classification-field noise from routing-rule divergence.</w:t>
       </w:r>
     </w:p>
     <w:p>
@@ -3357,16 +3357,7 @@
         <w:pStyle w:val="BodyText"/>
       </w:pPr>
       <w:r>
-        <w:t xml:space="preserve">This paper isolated </w:t>
-      </w:r>
-      <w:r>
-        <w:rPr>
-          <w:i/>
-        </w:rPr>
-        <w:t>which part of an LLM prompt</w:t>
-      </w:r>
-      <w:r>
-        <w:t xml:space="preserve"> is responsible for reliable RFI classification and routing, instead of only measuring whether an LLM can do the task at all. Across a stratified, adversarial, anti-fabrication 240-thread synthetic corpus, the answer is unambiguous: closed-vocabulary injection is the difference between a 0%- and a 100%-schema-valid pipeline (§5.1), while adding the deterministic routing-policy text on top of the vocabulary produces no further improvement in composed routing accuracy (73.5% vs. 74.0% on 200 EVAL-split threads, §5.2), a result a single end-to-end accuracy number would not have surfaced, and which the five-arm evaluation design (oracle / composed / direct / policy_fidelity / majority) was built specifically to separate from policy/gold divergence. Confidence/escalation gating further shows that most of the residual error is concentrated in a small, identifiable subpopulation (§5.3) instead of spread uniformly across the corpus, and a disclosed LLM-proxy second annotator agrees with gold most on structured fields and least on the single most judgment-dependent field, escalation (§5.4), a pattern consistent with the broader LLM-as-annotator literature's finding that LLM annotation reliability is uneven across field types, not a uniform stand-in for a human coder [25]. A full replication against a second commercial provider (§5.5) confirms both central findings within 1.5 accuracy points on every scoring arm: closed-vocabulary injection again separates a 0%- from a fully schema-valid pipeline, and the policy-text addition again produces no further improvement in composed routing accuracy over vocab alone. Within this synthetic, single-run-per-condition pilot, that agreement is evidence the findings are not one model's idiosyncrasy; it does not establish that closed-vocabulary injection is necessary or sufficient for schema validity across other prompt phrasings, model families, or real (non-synthetic) RFI text, a stronger claim only the replications named in §6.3 could support.</w:t>
+        <w:t>In this 240-thread synthetic pilot, supplying closed vocabularies made all evaluated outputs schema-valid, while adding routing-policy text produced little change in composed reviewer accuracy. The result was similar across the two providers tested. Because each condition was run once and the corpus is synthetic, performance on real project RFIs remains untested.</w:t>
       </w:r>
     </w:p>
     <w:p>

</xml_diff>